<commit_message>
Lock internal docs: resolve principle-level contradictions (GPT v5)
- Principle 3: BNBL's freedom to deal with any partner is unrestricted OUTSIDE the specific approved product/project/partner-project/opportunity where limited protection was expressly granted (removes conflict with NewCo limited protection)
- Principle 5: unearned milestone equity does NOT auto-vest; CoC + double-trigger acceleration limited to time-vested/pro-rata portion unless Party A approves otherwise in writing (closes the over-open reading)
- Disposition top-line: 'partners' -> 'approved commercial opportunities' for whole-doc consistency

Internal docs now locked for the 3-party Zoom / July counsel meeting.

https://claude.ai/code/session_01SkX9Nkj6o3KuWJL6HpkMeT
</commit_message>
<xml_diff>
--- a/BNBL_Negotiation_Principles_INTERNAL.docx
+++ b/BNBL_Negotiation_Principles_INTERNAL.docx
@@ -66,7 +66,7 @@
     </w:p>
     <w:p>
       <w:r>
-        <w:t>No blanket Field/Territory exclusivity. Only product-, project-, or approved opportunity-specific limited protection, milestone-based continuation, or a right of first negotiation (ROFN). BNBL's separate U.S. and global tracks, and BNBL's own dealings with any partner, remain unrestricted.</w:t>
+        <w:t>No blanket Field/Territory exclusivity. Only product-, project-, or approved opportunity-specific limited protection, milestone-based continuation, or a right of first negotiation (ROFN). BNBL's separate U.S. and global tracks, and BNBL's own dealings with any partner, remain unrestricted OUTSIDE the specific approved product, project, partner-project, or opportunity for which limited protection has been expressly granted.</w:t>
       </w:r>
     </w:p>
     <w:p>
@@ -94,7 +94,7 @@
     </w:p>
     <w:p>
       <w:r>
-        <w:t>Good-leaver protection for already-vested equity, objective pre-agreed milestones, a dispute path, data confidentiality, and properly limited commercial protections may be added. Unearned milestone equity does not auto-vest except under a BNBL-approved change of control with an agreed double-trigger.</w:t>
+        <w:t>Good-leaver protection for already-vested equity, objective pre-agreed milestones, a dispute path, data confidentiality, and properly limited commercial protections may be added. Unearned milestone equity does not auto-vest. Any acceleration upon a BNBL-approved change of control and agreed double-trigger is limited to the agreed time-vested or pro-rata portion, unless Party A separately approves otherwise in writing.</w:t>
       </w:r>
     </w:p>
     <w:p/>

</xml_diff>